<commit_message>
docs(acpos): apply six strong exact contract relations
</commit_message>
<xml_diff>
--- a/ACPOS_STR-01_WORKSPACE_MOTHER_BASIC_DESIGN_TECH_PURPLE_v1.0.docx
+++ b/ACPOS_STR-01_WORKSPACE_MOTHER_BASIC_DESIGN_TECH_PURPLE_v1.0.docx
@@ -25175,10 +25175,7 @@
           </w:tcPr>
           <w:p>
             <w:r>
-              <w:rPr>
-                <w:sz w:val="10"/>
-              </w:rPr>
-              <w:t>—</w:t>
+              <w:t>POST /v1/conversations/{CONVERSATION_ID}/messages</w:t>
             </w:r>
           </w:p>
         </w:tc>
@@ -25346,10 +25343,7 @@
           </w:tcPr>
           <w:p>
             <w:r>
-              <w:rPr>
-                <w:sz w:val="10"/>
-              </w:rPr>
-              <w:t>—</w:t>
+              <w:t>POST /v1/conversations/{CONVERSATION_ID}/generation/stop</w:t>
             </w:r>
           </w:p>
         </w:tc>
@@ -32015,10 +32009,7 @@
           </w:tcPr>
           <w:p>
             <w:r>
-              <w:rPr>
-                <w:sz w:val="10"/>
-              </w:rPr>
-              <w:t>—</w:t>
+              <w:t>POST /v1/conversations/{CONVERSATION_ID}/messages</w:t>
             </w:r>
           </w:p>
         </w:tc>
@@ -34351,8 +34342,453 @@
         </w:tc>
       </w:tr>
     </w:tbl>
+    <w:p>
+      <w:pPr>
+        <w:sectPr>
+          <w:pgSz w:w="12240" w:h="15840" w:orient="landscape"/>
+          <w:pgMar w:top="475" w:right="403" w:bottom="475" w:left="403" w:header="259" w:footer="259" w:gutter="0"/>
+          <w:cols w:space="720"/>
+          <w:docGrid w:linePitch="360"/>
+        </w:sectPr>
+      </w:pPr>
+    </w:p>
+    <w:p>
+      <w:pPr>
+        <w:pStyle w:val="Heading1"/>
+      </w:pPr>
+      <w:r>
+        <w:t>Batch 25 · Strong Exact Relation Binding Ledger</w:t>
+      </w:r>
+    </w:p>
+    <w:p>
+      <w:r>
+        <w:rPr>
+          <w:b/>
+        </w:rPr>
+        <w:t xml:space="preserve">[ACPOS-20260922-BATCH-25-STRONG-EXACT-RELATION-REMEDIATION-V1::PAGE::STR-01] </w:t>
+      </w:r>
+      <w:r>
+        <w:t>Only same Canonical Owner + same Operation + identical Runtime Status relations are materialized. No shared-Gate inference, label matching, blocked-source promotion, or cross-owner transfer is permitted.</w:t>
+      </w:r>
+    </w:p>
+    <w:tbl>
+      <w:tblPr>
+        <w:tblStyle w:val="TableGrid"/>
+        <w:tblW w:type="auto" w:w="0"/>
+        <w:tblLook w:firstColumn="1" w:firstRow="1" w:lastColumn="0" w:lastRow="0" w:noHBand="0" w:noVBand="1" w:val="04A0"/>
+      </w:tblPr>
+      <w:tblGrid>
+        <w:gridCol w:w="2506"/>
+        <w:gridCol w:w="2506"/>
+        <w:gridCol w:w="2506"/>
+        <w:gridCol w:w="2506"/>
+        <w:gridCol w:w="2506"/>
+        <w:gridCol w:w="2506"/>
+      </w:tblGrid>
+      <w:tr>
+        <w:trPr>
+          <w:tblHeader w:val="true"/>
+        </w:trPr>
+        <w:tc>
+          <w:tcPr>
+            <w:tcW w:type="dxa" w:w="2506"/>
+            <w:shd w:fill="EDE9FE"/>
+          </w:tcPr>
+          <w:p>
+            <w:pPr>
+              <w:spacing w:before="0" w:after="0"/>
+            </w:pPr>
+            <w:r>
+              <w:rPr>
+                <w:sz w:val="8"/>
+              </w:rPr>
+              <w:t>Control UID</w:t>
+            </w:r>
+          </w:p>
+        </w:tc>
+        <w:tc>
+          <w:tcPr>
+            <w:tcW w:type="dxa" w:w="2506"/>
+            <w:shd w:fill="EDE9FE"/>
+          </w:tcPr>
+          <w:p>
+            <w:pPr>
+              <w:spacing w:before="0" w:after="0"/>
+            </w:pPr>
+            <w:r>
+              <w:rPr>
+                <w:sz w:val="8"/>
+              </w:rPr>
+              <w:t>Field</w:t>
+            </w:r>
+          </w:p>
+        </w:tc>
+        <w:tc>
+          <w:tcPr>
+            <w:tcW w:type="dxa" w:w="2506"/>
+            <w:shd w:fill="EDE9FE"/>
+          </w:tcPr>
+          <w:p>
+            <w:pPr>
+              <w:spacing w:before="0" w:after="0"/>
+            </w:pPr>
+            <w:r>
+              <w:rPr>
+                <w:sz w:val="8"/>
+              </w:rPr>
+              <w:t>Operation</w:t>
+            </w:r>
+          </w:p>
+        </w:tc>
+        <w:tc>
+          <w:tcPr>
+            <w:tcW w:type="dxa" w:w="2506"/>
+            <w:shd w:fill="EDE9FE"/>
+          </w:tcPr>
+          <w:p>
+            <w:pPr>
+              <w:spacing w:before="0" w:after="0"/>
+            </w:pPr>
+            <w:r>
+              <w:rPr>
+                <w:sz w:val="8"/>
+              </w:rPr>
+              <w:t>Runtime Status</w:t>
+            </w:r>
+          </w:p>
+        </w:tc>
+        <w:tc>
+          <w:tcPr>
+            <w:tcW w:type="dxa" w:w="2506"/>
+            <w:shd w:fill="EDE9FE"/>
+          </w:tcPr>
+          <w:p>
+            <w:pPr>
+              <w:spacing w:before="0" w:after="0"/>
+            </w:pPr>
+            <w:r>
+              <w:rPr>
+                <w:sz w:val="8"/>
+              </w:rPr>
+              <w:t>Bound Value</w:t>
+            </w:r>
+          </w:p>
+        </w:tc>
+        <w:tc>
+          <w:tcPr>
+            <w:tcW w:type="dxa" w:w="2506"/>
+            <w:shd w:fill="EDE9FE"/>
+          </w:tcPr>
+          <w:p>
+            <w:pPr>
+              <w:spacing w:before="0" w:after="0"/>
+            </w:pPr>
+            <w:r>
+              <w:rPr>
+                <w:sz w:val="8"/>
+              </w:rPr>
+              <w:t>Result</w:t>
+            </w:r>
+          </w:p>
+        </w:tc>
+      </w:tr>
+      <w:tr>
+        <w:tc>
+          <w:tcPr>
+            <w:tcW w:type="dxa" w:w="2506"/>
+          </w:tcPr>
+          <w:p>
+            <w:pPr>
+              <w:spacing w:before="0" w:after="0"/>
+            </w:pPr>
+            <w:r>
+              <w:rPr>
+                <w:sz w:val="8"/>
+              </w:rPr>
+              <w:t>STR-01-BTN-SEND</w:t>
+            </w:r>
+          </w:p>
+        </w:tc>
+        <w:tc>
+          <w:tcPr>
+            <w:tcW w:type="dxa" w:w="2506"/>
+          </w:tcPr>
+          <w:p>
+            <w:pPr>
+              <w:spacing w:before="0" w:after="0"/>
+            </w:pPr>
+            <w:r>
+              <w:rPr>
+                <w:sz w:val="8"/>
+              </w:rPr>
+              <w:t>method_path</w:t>
+            </w:r>
+          </w:p>
+        </w:tc>
+        <w:tc>
+          <w:tcPr>
+            <w:tcW w:type="dxa" w:w="2506"/>
+          </w:tcPr>
+          <w:p>
+            <w:pPr>
+              <w:spacing w:before="0" w:after="0"/>
+            </w:pPr>
+            <w:r>
+              <w:rPr>
+                <w:sz w:val="8"/>
+              </w:rPr>
+              <w:t>sendConversationMessage</w:t>
+            </w:r>
+          </w:p>
+        </w:tc>
+        <w:tc>
+          <w:tcPr>
+            <w:tcW w:type="dxa" w:w="2506"/>
+          </w:tcPr>
+          <w:p>
+            <w:pPr>
+              <w:spacing w:before="0" w:after="0"/>
+            </w:pPr>
+            <w:r>
+              <w:rPr>
+                <w:sz w:val="8"/>
+              </w:rPr>
+              <w:t>EFFECTFUL_EXACT</w:t>
+            </w:r>
+          </w:p>
+        </w:tc>
+        <w:tc>
+          <w:tcPr>
+            <w:tcW w:type="dxa" w:w="2506"/>
+          </w:tcPr>
+          <w:p>
+            <w:pPr>
+              <w:spacing w:before="0" w:after="0"/>
+            </w:pPr>
+            <w:r>
+              <w:rPr>
+                <w:sz w:val="8"/>
+              </w:rPr>
+              <w:t>POST /v1/conversations/{CONVERSATION_ID}/messages</w:t>
+            </w:r>
+          </w:p>
+        </w:tc>
+        <w:tc>
+          <w:tcPr>
+            <w:tcW w:type="dxa" w:w="2506"/>
+          </w:tcPr>
+          <w:p>
+            <w:pPr>
+              <w:spacing w:before="0" w:after="0"/>
+            </w:pPr>
+            <w:r>
+              <w:rPr>
+                <w:sz w:val="8"/>
+              </w:rPr>
+              <w:t>STRONG_EXACT_RELATION_BOUND</w:t>
+            </w:r>
+          </w:p>
+        </w:tc>
+      </w:tr>
+      <w:tr>
+        <w:tc>
+          <w:tcPr>
+            <w:tcW w:type="dxa" w:w="2506"/>
+          </w:tcPr>
+          <w:p>
+            <w:pPr>
+              <w:spacing w:before="0" w:after="0"/>
+            </w:pPr>
+            <w:r>
+              <w:rPr>
+                <w:sz w:val="8"/>
+              </w:rPr>
+              <w:t>STR-01-BTN-STOP</w:t>
+            </w:r>
+          </w:p>
+        </w:tc>
+        <w:tc>
+          <w:tcPr>
+            <w:tcW w:type="dxa" w:w="2506"/>
+          </w:tcPr>
+          <w:p>
+            <w:pPr>
+              <w:spacing w:before="0" w:after="0"/>
+            </w:pPr>
+            <w:r>
+              <w:rPr>
+                <w:sz w:val="8"/>
+              </w:rPr>
+              <w:t>method_path</w:t>
+            </w:r>
+          </w:p>
+        </w:tc>
+        <w:tc>
+          <w:tcPr>
+            <w:tcW w:type="dxa" w:w="2506"/>
+          </w:tcPr>
+          <w:p>
+            <w:pPr>
+              <w:spacing w:before="0" w:after="0"/>
+            </w:pPr>
+            <w:r>
+              <w:rPr>
+                <w:sz w:val="8"/>
+              </w:rPr>
+              <w:t>stopConversationGeneration</w:t>
+            </w:r>
+          </w:p>
+        </w:tc>
+        <w:tc>
+          <w:tcPr>
+            <w:tcW w:type="dxa" w:w="2506"/>
+          </w:tcPr>
+          <w:p>
+            <w:pPr>
+              <w:spacing w:before="0" w:after="0"/>
+            </w:pPr>
+            <w:r>
+              <w:rPr>
+                <w:sz w:val="8"/>
+              </w:rPr>
+              <w:t>EFFECTFUL_EXACT</w:t>
+            </w:r>
+          </w:p>
+        </w:tc>
+        <w:tc>
+          <w:tcPr>
+            <w:tcW w:type="dxa" w:w="2506"/>
+          </w:tcPr>
+          <w:p>
+            <w:pPr>
+              <w:spacing w:before="0" w:after="0"/>
+            </w:pPr>
+            <w:r>
+              <w:rPr>
+                <w:sz w:val="8"/>
+              </w:rPr>
+              <w:t>POST /v1/conversations/{CONVERSATION_ID}/generation/stop</w:t>
+            </w:r>
+          </w:p>
+        </w:tc>
+        <w:tc>
+          <w:tcPr>
+            <w:tcW w:type="dxa" w:w="2506"/>
+          </w:tcPr>
+          <w:p>
+            <w:pPr>
+              <w:spacing w:before="0" w:after="0"/>
+            </w:pPr>
+            <w:r>
+              <w:rPr>
+                <w:sz w:val="8"/>
+              </w:rPr>
+              <w:t>STRONG_EXACT_RELATION_BOUND</w:t>
+            </w:r>
+          </w:p>
+        </w:tc>
+      </w:tr>
+      <w:tr>
+        <w:tc>
+          <w:tcPr>
+            <w:tcW w:type="dxa" w:w="2506"/>
+          </w:tcPr>
+          <w:p>
+            <w:pPr>
+              <w:spacing w:before="0" w:after="0"/>
+            </w:pPr>
+            <w:r>
+              <w:rPr>
+                <w:sz w:val="8"/>
+              </w:rPr>
+              <w:t>STR-01-INP-MESSAGE</w:t>
+            </w:r>
+          </w:p>
+        </w:tc>
+        <w:tc>
+          <w:tcPr>
+            <w:tcW w:type="dxa" w:w="2506"/>
+          </w:tcPr>
+          <w:p>
+            <w:pPr>
+              <w:spacing w:before="0" w:after="0"/>
+            </w:pPr>
+            <w:r>
+              <w:rPr>
+                <w:sz w:val="8"/>
+              </w:rPr>
+              <w:t>method_path</w:t>
+            </w:r>
+          </w:p>
+        </w:tc>
+        <w:tc>
+          <w:tcPr>
+            <w:tcW w:type="dxa" w:w="2506"/>
+          </w:tcPr>
+          <w:p>
+            <w:pPr>
+              <w:spacing w:before="0" w:after="0"/>
+            </w:pPr>
+            <w:r>
+              <w:rPr>
+                <w:sz w:val="8"/>
+              </w:rPr>
+              <w:t>sendConversationMessage</w:t>
+            </w:r>
+          </w:p>
+        </w:tc>
+        <w:tc>
+          <w:tcPr>
+            <w:tcW w:type="dxa" w:w="2506"/>
+          </w:tcPr>
+          <w:p>
+            <w:pPr>
+              <w:spacing w:before="0" w:after="0"/>
+            </w:pPr>
+            <w:r>
+              <w:rPr>
+                <w:sz w:val="8"/>
+              </w:rPr>
+              <w:t>EFFECTFUL_EXACT</w:t>
+            </w:r>
+          </w:p>
+        </w:tc>
+        <w:tc>
+          <w:tcPr>
+            <w:tcW w:type="dxa" w:w="2506"/>
+          </w:tcPr>
+          <w:p>
+            <w:pPr>
+              <w:spacing w:before="0" w:after="0"/>
+            </w:pPr>
+            <w:r>
+              <w:rPr>
+                <w:sz w:val="8"/>
+              </w:rPr>
+              <w:t>POST /v1/conversations/{CONVERSATION_ID}/messages</w:t>
+            </w:r>
+          </w:p>
+        </w:tc>
+        <w:tc>
+          <w:tcPr>
+            <w:tcW w:type="dxa" w:w="2506"/>
+          </w:tcPr>
+          <w:p>
+            <w:pPr>
+              <w:spacing w:before="0" w:after="0"/>
+            </w:pPr>
+            <w:r>
+              <w:rPr>
+                <w:sz w:val="8"/>
+              </w:rPr>
+              <w:t>STRONG_EXACT_RELATION_BOUND</w:t>
+            </w:r>
+          </w:p>
+        </w:tc>
+      </w:tr>
+    </w:tbl>
     <w:sectPr>
-      <w:pgSz w:w="12240" w:h="15840" w:orient="landscape"/>
+      <w:pgSz w:w="15840" w:h="12240" w:orient="landscape"/>
       <w:pgMar w:top="475" w:right="403" w:bottom="475" w:left="403" w:header="259" w:footer="259" w:gutter="0"/>
       <w:cols w:space="720"/>
       <w:docGrid w:linePitch="360"/>

</xml_diff>

<commit_message>
docs(acpos): reconcile read and adopt canonical contracts
</commit_message>
<xml_diff>
--- a/ACPOS_STR-01_WORKSPACE_MOTHER_BASIC_DESIGN_TECH_PURPLE_v1.0.docx
+++ b/ACPOS_STR-01_WORKSPACE_MOTHER_BASIC_DESIGN_TECH_PURPLE_v1.0.docx
@@ -24297,10 +24297,7 @@
           </w:tcPr>
           <w:p>
             <w:r>
-              <w:rPr>
-                <w:sz w:val="10"/>
-              </w:rPr>
-              <w:t>—</w:t>
+              <w:t>AdoptAsContextCandidateRequest</w:t>
             </w:r>
           </w:p>
         </w:tc>
@@ -24323,10 +24320,7 @@
           </w:tcPr>
           <w:p>
             <w:r>
-              <w:rPr>
-                <w:sz w:val="10"/>
-              </w:rPr>
-              <w:t>—</w:t>
+              <w:t>POST /v1/state-commands/strategycandidate/adoptascontextcandidate</w:t>
             </w:r>
           </w:p>
         </w:tc>
@@ -24807,6 +24801,52 @@
           </w:tcPr>
           <w:p>
             <w:r>
+              <w:t>No-form read contract</w:t>
+            </w:r>
+          </w:p>
+        </w:tc>
+        <w:tc>
+          <w:tcPr>
+            <w:tcW w:type="dxa" w:w="1141"/>
+          </w:tcPr>
+          <w:p>
+            <w:r>
+              <w:rPr>
+                <w:sz w:val="10"/>
+              </w:rPr>
+              <w:t>compareCandidates</w:t>
+            </w:r>
+          </w:p>
+        </w:tc>
+        <w:tc>
+          <w:tcPr>
+            <w:tcW w:type="dxa" w:w="1141"/>
+          </w:tcPr>
+          <w:p>
+            <w:r>
+              <w:t>GET /v1/candidates/compare</w:t>
+            </w:r>
+          </w:p>
+        </w:tc>
+        <w:tc>
+          <w:tcPr>
+            <w:tcW w:type="dxa" w:w="1141"/>
+          </w:tcPr>
+          <w:p>
+            <w:r>
+              <w:rPr>
+                <w:sz w:val="10"/>
+              </w:rPr>
+              <w:t>STR-01 / shared registered service</w:t>
+            </w:r>
+          </w:p>
+        </w:tc>
+        <w:tc>
+          <w:tcPr>
+            <w:tcW w:type="dxa" w:w="1141"/>
+          </w:tcPr>
+          <w:p>
+            <w:r>
               <w:rPr>
                 <w:sz w:val="10"/>
               </w:rPr>
@@ -24820,62 +24860,7 @@
           </w:tcPr>
           <w:p>
             <w:r>
-              <w:rPr>
-                <w:sz w:val="10"/>
-              </w:rPr>
-              <w:t>compareCandidates</w:t>
-            </w:r>
-          </w:p>
-        </w:tc>
-        <w:tc>
-          <w:tcPr>
-            <w:tcW w:type="dxa" w:w="1141"/>
-          </w:tcPr>
-          <w:p>
-            <w:r>
-              <w:rPr>
-                <w:sz w:val="10"/>
-              </w:rPr>
-              <w:t>—</w:t>
-            </w:r>
-          </w:p>
-        </w:tc>
-        <w:tc>
-          <w:tcPr>
-            <w:tcW w:type="dxa" w:w="1141"/>
-          </w:tcPr>
-          <w:p>
-            <w:r>
-              <w:rPr>
-                <w:sz w:val="10"/>
-              </w:rPr>
-              <w:t>STR-01 / shared registered service</w:t>
-            </w:r>
-          </w:p>
-        </w:tc>
-        <w:tc>
-          <w:tcPr>
-            <w:tcW w:type="dxa" w:w="1141"/>
-          </w:tcPr>
-          <w:p>
-            <w:r>
-              <w:rPr>
-                <w:sz w:val="10"/>
-              </w:rPr>
-              <w:t>—</w:t>
-            </w:r>
-          </w:p>
-        </w:tc>
-        <w:tc>
-          <w:tcPr>
-            <w:tcW w:type="dxa" w:w="1141"/>
-          </w:tcPr>
-          <w:p>
-            <w:r>
-              <w:rPr>
-                <w:sz w:val="10"/>
-              </w:rPr>
-              <w:t>EFFECTFUL_EXACT</w:t>
+              <w:t>READ_EXACT</w:t>
             </w:r>
           </w:p>
         </w:tc>
@@ -33519,6 +33504,52 @@
           </w:tcPr>
           <w:p>
             <w:r>
+              <w:t>No-form read contract</w:t>
+            </w:r>
+          </w:p>
+        </w:tc>
+        <w:tc>
+          <w:tcPr>
+            <w:tcW w:type="dxa" w:w="1141"/>
+          </w:tcPr>
+          <w:p>
+            <w:r>
+              <w:rPr>
+                <w:sz w:val="10"/>
+              </w:rPr>
+              <w:t>compareCandidates</w:t>
+            </w:r>
+          </w:p>
+        </w:tc>
+        <w:tc>
+          <w:tcPr>
+            <w:tcW w:type="dxa" w:w="1141"/>
+          </w:tcPr>
+          <w:p>
+            <w:r>
+              <w:t>GET /v1/candidates/compare</w:t>
+            </w:r>
+          </w:p>
+        </w:tc>
+        <w:tc>
+          <w:tcPr>
+            <w:tcW w:type="dxa" w:w="1141"/>
+          </w:tcPr>
+          <w:p>
+            <w:r>
+              <w:rPr>
+                <w:sz w:val="10"/>
+              </w:rPr>
+              <w:t>STR-01 / shared registered service</w:t>
+            </w:r>
+          </w:p>
+        </w:tc>
+        <w:tc>
+          <w:tcPr>
+            <w:tcW w:type="dxa" w:w="1141"/>
+          </w:tcPr>
+          <w:p>
+            <w:r>
               <w:rPr>
                 <w:sz w:val="10"/>
               </w:rPr>
@@ -33532,62 +33563,7 @@
           </w:tcPr>
           <w:p>
             <w:r>
-              <w:rPr>
-                <w:sz w:val="10"/>
-              </w:rPr>
-              <w:t>compareCandidates</w:t>
-            </w:r>
-          </w:p>
-        </w:tc>
-        <w:tc>
-          <w:tcPr>
-            <w:tcW w:type="dxa" w:w="1141"/>
-          </w:tcPr>
-          <w:p>
-            <w:r>
-              <w:rPr>
-                <w:sz w:val="10"/>
-              </w:rPr>
-              <w:t>—</w:t>
-            </w:r>
-          </w:p>
-        </w:tc>
-        <w:tc>
-          <w:tcPr>
-            <w:tcW w:type="dxa" w:w="1141"/>
-          </w:tcPr>
-          <w:p>
-            <w:r>
-              <w:rPr>
-                <w:sz w:val="10"/>
-              </w:rPr>
-              <w:t>STR-01 / shared registered service</w:t>
-            </w:r>
-          </w:p>
-        </w:tc>
-        <w:tc>
-          <w:tcPr>
-            <w:tcW w:type="dxa" w:w="1141"/>
-          </w:tcPr>
-          <w:p>
-            <w:r>
-              <w:rPr>
-                <w:sz w:val="10"/>
-              </w:rPr>
-              <w:t>—</w:t>
-            </w:r>
-          </w:p>
-        </w:tc>
-        <w:tc>
-          <w:tcPr>
-            <w:tcW w:type="dxa" w:w="1141"/>
-          </w:tcPr>
-          <w:p>
-            <w:r>
-              <w:rPr>
-                <w:sz w:val="10"/>
-              </w:rPr>
-              <w:t>EFFECTFUL_EXACT</w:t>
+              <w:t>READ_EXACT</w:t>
             </w:r>
           </w:p>
         </w:tc>
@@ -34787,8 +34763,387 @@
         </w:tc>
       </w:tr>
     </w:tbl>
+    <w:p>
+      <w:pPr>
+        <w:sectPr>
+          <w:pgSz w:w="15840" w:h="12240" w:orient="landscape"/>
+          <w:pgMar w:top="475" w:right="403" w:bottom="475" w:left="403" w:header="259" w:footer="259" w:gutter="0"/>
+          <w:cols w:space="720"/>
+          <w:docGrid w:linePitch="360"/>
+        </w:sectPr>
+      </w:pPr>
+    </w:p>
+    <w:p>
+      <w:pPr>
+        <w:pStyle w:val="Heading1"/>
+      </w:pPr>
+      <w:r>
+        <w:t>Batch 27 · Canonical Contract Reconciliation Ledger</w:t>
+      </w:r>
+    </w:p>
+    <w:p>
+      <w:r>
+        <w:rPr>
+          <w:b/>
+        </w:rPr>
+        <w:t xml:space="preserve">[ACPOS-20260922-BATCH-27-CANONICAL-CONTRACT-RECONCILIATION-V1::PAGE::STR-01] </w:t>
+      </w:r>
+      <w:r>
+        <w:t>Bindings below are synchronized from the matching Canonical Owner amendment. Read-only controls do not acquire a Persistence Owner. Runtime execution remains outside this Word evidence.</w:t>
+      </w:r>
+    </w:p>
+    <w:tbl>
+      <w:tblPr>
+        <w:tblStyle w:val="TableGrid"/>
+        <w:tblW w:type="auto" w:w="0"/>
+        <w:tblLook w:firstColumn="1" w:firstRow="1" w:lastColumn="0" w:lastRow="0" w:noHBand="0" w:noVBand="1" w:val="04A0"/>
+      </w:tblPr>
+      <w:tblGrid>
+        <w:gridCol w:w="2287"/>
+        <w:gridCol w:w="2287"/>
+        <w:gridCol w:w="2287"/>
+        <w:gridCol w:w="2287"/>
+        <w:gridCol w:w="2287"/>
+      </w:tblGrid>
+      <w:tr>
+        <w:trPr>
+          <w:tblHeader w:val="true"/>
+        </w:trPr>
+        <w:tc>
+          <w:tcPr>
+            <w:tcW w:type="dxa" w:w="2287"/>
+            <w:shd w:fill="EDE9FE"/>
+          </w:tcPr>
+          <w:p>
+            <w:pPr>
+              <w:spacing w:before="0" w:after="0"/>
+            </w:pPr>
+            <w:r>
+              <w:rPr>
+                <w:sz w:val="8"/>
+              </w:rPr>
+              <w:t>Control UID</w:t>
+            </w:r>
+          </w:p>
+        </w:tc>
+        <w:tc>
+          <w:tcPr>
+            <w:tcW w:type="dxa" w:w="2287"/>
+            <w:shd w:fill="EDE9FE"/>
+          </w:tcPr>
+          <w:p>
+            <w:pPr>
+              <w:spacing w:before="0" w:after="0"/>
+            </w:pPr>
+            <w:r>
+              <w:rPr>
+                <w:sz w:val="8"/>
+              </w:rPr>
+              <w:t>Operation</w:t>
+            </w:r>
+          </w:p>
+        </w:tc>
+        <w:tc>
+          <w:tcPr>
+            <w:tcW w:type="dxa" w:w="2287"/>
+            <w:shd w:fill="EDE9FE"/>
+          </w:tcPr>
+          <w:p>
+            <w:pPr>
+              <w:spacing w:before="0" w:after="0"/>
+            </w:pPr>
+            <w:r>
+              <w:rPr>
+                <w:sz w:val="8"/>
+              </w:rPr>
+              <w:t>Runtime Status</w:t>
+            </w:r>
+          </w:p>
+        </w:tc>
+        <w:tc>
+          <w:tcPr>
+            <w:tcW w:type="dxa" w:w="2287"/>
+            <w:shd w:fill="EDE9FE"/>
+          </w:tcPr>
+          <w:p>
+            <w:pPr>
+              <w:spacing w:before="0" w:after="0"/>
+            </w:pPr>
+            <w:r>
+              <w:rPr>
+                <w:sz w:val="8"/>
+              </w:rPr>
+              <w:t>Method / Path</w:t>
+            </w:r>
+          </w:p>
+        </w:tc>
+        <w:tc>
+          <w:tcPr>
+            <w:tcW w:type="dxa" w:w="2287"/>
+            <w:shd w:fill="EDE9FE"/>
+          </w:tcPr>
+          <w:p>
+            <w:pPr>
+              <w:spacing w:before="0" w:after="0"/>
+            </w:pPr>
+            <w:r>
+              <w:rPr>
+                <w:sz w:val="8"/>
+              </w:rPr>
+              <w:t>Result</w:t>
+            </w:r>
+          </w:p>
+        </w:tc>
+      </w:tr>
+      <w:tr>
+        <w:tc>
+          <w:tcPr>
+            <w:tcW w:type="dxa" w:w="2287"/>
+          </w:tcPr>
+          <w:p>
+            <w:pPr>
+              <w:spacing w:before="0" w:after="0"/>
+            </w:pPr>
+            <w:r>
+              <w:rPr>
+                <w:sz w:val="8"/>
+              </w:rPr>
+              <w:t>STR-01-TBL-COMPARE</w:t>
+            </w:r>
+          </w:p>
+        </w:tc>
+        <w:tc>
+          <w:tcPr>
+            <w:tcW w:type="dxa" w:w="2287"/>
+          </w:tcPr>
+          <w:p>
+            <w:pPr>
+              <w:spacing w:before="0" w:after="0"/>
+            </w:pPr>
+            <w:r>
+              <w:rPr>
+                <w:sz w:val="8"/>
+              </w:rPr>
+              <w:t>compareCandidates</w:t>
+            </w:r>
+          </w:p>
+        </w:tc>
+        <w:tc>
+          <w:tcPr>
+            <w:tcW w:type="dxa" w:w="2287"/>
+          </w:tcPr>
+          <w:p>
+            <w:pPr>
+              <w:spacing w:before="0" w:after="0"/>
+            </w:pPr>
+            <w:r>
+              <w:rPr>
+                <w:sz w:val="8"/>
+              </w:rPr>
+              <w:t>READ_EXACT</w:t>
+            </w:r>
+          </w:p>
+        </w:tc>
+        <w:tc>
+          <w:tcPr>
+            <w:tcW w:type="dxa" w:w="2287"/>
+          </w:tcPr>
+          <w:p>
+            <w:pPr>
+              <w:spacing w:before="0" w:after="0"/>
+            </w:pPr>
+            <w:r>
+              <w:rPr>
+                <w:sz w:val="8"/>
+              </w:rPr>
+              <w:t>GET /v1/candidates/compare</w:t>
+            </w:r>
+          </w:p>
+        </w:tc>
+        <w:tc>
+          <w:tcPr>
+            <w:tcW w:type="dxa" w:w="2287"/>
+          </w:tcPr>
+          <w:p>
+            <w:pPr>
+              <w:spacing w:before="0" w:after="0"/>
+            </w:pPr>
+            <w:r>
+              <w:rPr>
+                <w:sz w:val="8"/>
+              </w:rPr>
+              <w:t>No-form read; persistence owner non-applicable</w:t>
+            </w:r>
+          </w:p>
+        </w:tc>
+      </w:tr>
+      <w:tr>
+        <w:tc>
+          <w:tcPr>
+            <w:tcW w:type="dxa" w:w="2287"/>
+          </w:tcPr>
+          <w:p>
+            <w:pPr>
+              <w:spacing w:before="0" w:after="0"/>
+            </w:pPr>
+            <w:r>
+              <w:rPr>
+                <w:sz w:val="8"/>
+              </w:rPr>
+              <w:t>STR-01-BTN-COMPARE</w:t>
+            </w:r>
+          </w:p>
+        </w:tc>
+        <w:tc>
+          <w:tcPr>
+            <w:tcW w:type="dxa" w:w="2287"/>
+          </w:tcPr>
+          <w:p>
+            <w:pPr>
+              <w:spacing w:before="0" w:after="0"/>
+            </w:pPr>
+            <w:r>
+              <w:rPr>
+                <w:sz w:val="8"/>
+              </w:rPr>
+              <w:t>compareCandidates</w:t>
+            </w:r>
+          </w:p>
+        </w:tc>
+        <w:tc>
+          <w:tcPr>
+            <w:tcW w:type="dxa" w:w="2287"/>
+          </w:tcPr>
+          <w:p>
+            <w:pPr>
+              <w:spacing w:before="0" w:after="0"/>
+            </w:pPr>
+            <w:r>
+              <w:rPr>
+                <w:sz w:val="8"/>
+              </w:rPr>
+              <w:t>READ_EXACT</w:t>
+            </w:r>
+          </w:p>
+        </w:tc>
+        <w:tc>
+          <w:tcPr>
+            <w:tcW w:type="dxa" w:w="2287"/>
+          </w:tcPr>
+          <w:p>
+            <w:pPr>
+              <w:spacing w:before="0" w:after="0"/>
+            </w:pPr>
+            <w:r>
+              <w:rPr>
+                <w:sz w:val="8"/>
+              </w:rPr>
+              <w:t>GET /v1/candidates/compare</w:t>
+            </w:r>
+          </w:p>
+        </w:tc>
+        <w:tc>
+          <w:tcPr>
+            <w:tcW w:type="dxa" w:w="2287"/>
+          </w:tcPr>
+          <w:p>
+            <w:pPr>
+              <w:spacing w:before="0" w:after="0"/>
+            </w:pPr>
+            <w:r>
+              <w:rPr>
+                <w:sz w:val="8"/>
+              </w:rPr>
+              <w:t>No-form read; persistence owner non-applicable</w:t>
+            </w:r>
+          </w:p>
+        </w:tc>
+      </w:tr>
+      <w:tr>
+        <w:tc>
+          <w:tcPr>
+            <w:tcW w:type="dxa" w:w="2287"/>
+          </w:tcPr>
+          <w:p>
+            <w:pPr>
+              <w:spacing w:before="0" w:after="0"/>
+            </w:pPr>
+            <w:r>
+              <w:rPr>
+                <w:sz w:val="8"/>
+              </w:rPr>
+              <w:t>STR-01-BTN-ADOPT</w:t>
+            </w:r>
+          </w:p>
+        </w:tc>
+        <w:tc>
+          <w:tcPr>
+            <w:tcW w:type="dxa" w:w="2287"/>
+          </w:tcPr>
+          <w:p>
+            <w:pPr>
+              <w:spacing w:before="0" w:after="0"/>
+            </w:pPr>
+            <w:r>
+              <w:rPr>
+                <w:sz w:val="8"/>
+              </w:rPr>
+              <w:t>adoptAsContextCandidate</w:t>
+            </w:r>
+          </w:p>
+        </w:tc>
+        <w:tc>
+          <w:tcPr>
+            <w:tcW w:type="dxa" w:w="2287"/>
+          </w:tcPr>
+          <w:p>
+            <w:pPr>
+              <w:spacing w:before="0" w:after="0"/>
+            </w:pPr>
+            <w:r>
+              <w:rPr>
+                <w:sz w:val="8"/>
+              </w:rPr>
+              <w:t>EFFECTFUL_EXACT</w:t>
+            </w:r>
+          </w:p>
+        </w:tc>
+        <w:tc>
+          <w:tcPr>
+            <w:tcW w:type="dxa" w:w="2287"/>
+          </w:tcPr>
+          <w:p>
+            <w:pPr>
+              <w:spacing w:before="0" w:after="0"/>
+            </w:pPr>
+            <w:r>
+              <w:rPr>
+                <w:sz w:val="8"/>
+              </w:rPr>
+              <w:t>POST /v1/state-commands/strategycandidate/adoptascontextcandidate</w:t>
+            </w:r>
+          </w:p>
+        </w:tc>
+        <w:tc>
+          <w:tcPr>
+            <w:tcW w:type="dxa" w:w="2287"/>
+          </w:tcPr>
+          <w:p>
+            <w:pPr>
+              <w:spacing w:before="0" w:after="0"/>
+            </w:pPr>
+            <w:r>
+              <w:rPr>
+                <w:sz w:val="8"/>
+              </w:rPr>
+              <w:t>Payload=AdoptAsContextCandidateRequest</w:t>
+            </w:r>
+          </w:p>
+        </w:tc>
+      </w:tr>
+    </w:tbl>
     <w:sectPr>
-      <w:pgSz w:w="15840" w:h="12240" w:orient="landscape"/>
+      <w:pgSz w:w="12240" w:h="15840" w:orient="landscape"/>
       <w:pgMar w:top="475" w:right="403" w:bottom="475" w:left="403" w:header="259" w:footer="259" w:gutter="0"/>
       <w:cols w:space="720"/>
       <w:docGrid w:linePitch="360"/>

</xml_diff>

<commit_message>
docs(acpos): close system02 conversation contract gaps
</commit_message>
<xml_diff>
--- a/ACPOS_STR-01_WORKSPACE_MOTHER_BASIC_DESIGN_TECH_PURPLE_v1.0.docx
+++ b/ACPOS_STR-01_WORKSPACE_MOTHER_BASIC_DESIGN_TECH_PURPLE_v1.0.docx
@@ -24485,10 +24485,7 @@
           </w:tcPr>
           <w:p>
             <w:r>
-              <w:rPr>
-                <w:sz w:val="10"/>
-              </w:rPr>
-              <w:t>—</w:t>
+              <w:t>GET /v1/conversations/{CONVERSATION_ID}/attachments/{ATTACHMENT_ID}/context</w:t>
             </w:r>
           </w:p>
         </w:tc>
@@ -25134,10 +25131,7 @@
           </w:tcPr>
           <w:p>
             <w:r>
-              <w:rPr>
-                <w:sz w:val="10"/>
-              </w:rPr>
-              <w:t>—</w:t>
+              <w:t>SendConversationMessageRequest</w:t>
             </w:r>
           </w:p>
         </w:tc>
@@ -25183,10 +25177,7 @@
           </w:tcPr>
           <w:p>
             <w:r>
-              <w:rPr>
-                <w:sz w:val="10"/>
-              </w:rPr>
-              <w:t>—</w:t>
+              <w:t>Shared Conversation Core / ConversationMessage + ConversationContextBinding</w:t>
             </w:r>
           </w:p>
         </w:tc>
@@ -25302,10 +25293,7 @@
           </w:tcPr>
           <w:p>
             <w:r>
-              <w:rPr>
-                <w:sz w:val="10"/>
-              </w:rPr>
-              <w:t>—</w:t>
+              <w:t>StopConversationGenerationRequest</w:t>
             </w:r>
           </w:p>
         </w:tc>
@@ -25351,10 +25339,7 @@
           </w:tcPr>
           <w:p>
             <w:r>
-              <w:rPr>
-                <w:sz w:val="10"/>
-              </w:rPr>
-              <w:t>—</w:t>
+              <w:t>ACPOS-AI-03 Runtime Job + ACPOS-AI-02 ConversationAuditEnvelope</w:t>
             </w:r>
           </w:p>
         </w:tc>
@@ -31968,10 +31953,7 @@
           </w:tcPr>
           <w:p>
             <w:r>
-              <w:rPr>
-                <w:sz w:val="10"/>
-              </w:rPr>
-              <w:t>—</w:t>
+              <w:t>SendConversationMessageRequest</w:t>
             </w:r>
           </w:p>
         </w:tc>
@@ -32017,10 +31999,7 @@
           </w:tcPr>
           <w:p>
             <w:r>
-              <w:rPr>
-                <w:sz w:val="10"/>
-              </w:rPr>
-              <w:t>—</w:t>
+              <w:t>Shared Conversation Core / ConversationMessage + ConversationContextBinding</w:t>
             </w:r>
           </w:p>
         </w:tc>
@@ -33860,10 +33839,7 @@
           </w:tcPr>
           <w:p>
             <w:r>
-              <w:rPr>
-                <w:sz w:val="10"/>
-              </w:rPr>
-              <w:t>—</w:t>
+              <w:t>GET /v1/conversations/{CONVERSATION_ID}/projections/strategy</w:t>
             </w:r>
           </w:p>
         </w:tc>
@@ -35142,8 +35118,649 @@
         </w:tc>
       </w:tr>
     </w:tbl>
+    <w:p>
+      <w:pPr>
+        <w:sectPr>
+          <w:pgSz w:w="12240" w:h="15840" w:orient="landscape"/>
+          <w:pgMar w:top="475" w:right="403" w:bottom="475" w:left="403" w:header="259" w:footer="259" w:gutter="0"/>
+          <w:cols w:space="720"/>
+          <w:docGrid w:linePitch="360"/>
+        </w:sectPr>
+      </w:pPr>
+    </w:p>
+    <w:p>
+      <w:pPr>
+        <w:pStyle w:val="Heading1"/>
+      </w:pPr>
+      <w:r>
+        <w:t>Batch 36 · Shared Conversation Core Contract Binding Ledger</w:t>
+      </w:r>
+    </w:p>
+    <w:p>
+      <w:r>
+        <w:rPr>
+          <w:b/>
+        </w:rPr>
+        <w:t xml:space="preserve">[ACPOS-20260922-BATCH-36-SYSTEM02-CANONICAL-CONTRACT-REMEDIATION-V1::PAGE::STR-01] </w:t>
+      </w:r>
+      <w:r>
+        <w:t>Only the fields listed in the Current 324-cell denominator are synchronized. Existing Action/Gate/Permission/Operation/Runtime Owner/Runtime Status values remain unchanged.</w:t>
+      </w:r>
+    </w:p>
+    <w:tbl>
+      <w:tblPr>
+        <w:tblStyle w:val="TableGrid"/>
+        <w:tblW w:type="auto" w:w="0"/>
+        <w:tblLook w:firstColumn="1" w:firstRow="1" w:lastColumn="0" w:lastRow="0" w:noHBand="0" w:noVBand="1" w:val="04A0"/>
+      </w:tblPr>
+      <w:tblGrid>
+        <w:gridCol w:w="2506"/>
+        <w:gridCol w:w="2506"/>
+        <w:gridCol w:w="2506"/>
+        <w:gridCol w:w="2506"/>
+        <w:gridCol w:w="2506"/>
+        <w:gridCol w:w="2506"/>
+      </w:tblGrid>
+      <w:tr>
+        <w:trPr>
+          <w:tblHeader w:val="true"/>
+        </w:trPr>
+        <w:tc>
+          <w:tcPr>
+            <w:tcW w:type="dxa" w:w="2506"/>
+            <w:shd w:fill="EDE9FE"/>
+          </w:tcPr>
+          <w:p>
+            <w:pPr>
+              <w:spacing w:before="0" w:after="0"/>
+            </w:pPr>
+            <w:r>
+              <w:rPr>
+                <w:sz w:val="7"/>
+              </w:rPr>
+              <w:t>Control UID</w:t>
+            </w:r>
+          </w:p>
+        </w:tc>
+        <w:tc>
+          <w:tcPr>
+            <w:tcW w:type="dxa" w:w="2506"/>
+            <w:shd w:fill="EDE9FE"/>
+          </w:tcPr>
+          <w:p>
+            <w:pPr>
+              <w:spacing w:before="0" w:after="0"/>
+            </w:pPr>
+            <w:r>
+              <w:rPr>
+                <w:sz w:val="7"/>
+              </w:rPr>
+              <w:t>Operation</w:t>
+            </w:r>
+          </w:p>
+        </w:tc>
+        <w:tc>
+          <w:tcPr>
+            <w:tcW w:type="dxa" w:w="2506"/>
+            <w:shd w:fill="EDE9FE"/>
+          </w:tcPr>
+          <w:p>
+            <w:pPr>
+              <w:spacing w:before="0" w:after="0"/>
+            </w:pPr>
+            <w:r>
+              <w:rPr>
+                <w:sz w:val="7"/>
+              </w:rPr>
+              <w:t>Fields Closed</w:t>
+            </w:r>
+          </w:p>
+        </w:tc>
+        <w:tc>
+          <w:tcPr>
+            <w:tcW w:type="dxa" w:w="2506"/>
+            <w:shd w:fill="EDE9FE"/>
+          </w:tcPr>
+          <w:p>
+            <w:pPr>
+              <w:spacing w:before="0" w:after="0"/>
+            </w:pPr>
+            <w:r>
+              <w:rPr>
+                <w:sz w:val="7"/>
+              </w:rPr>
+              <w:t>Method / Path</w:t>
+            </w:r>
+          </w:p>
+        </w:tc>
+        <w:tc>
+          <w:tcPr>
+            <w:tcW w:type="dxa" w:w="2506"/>
+            <w:shd w:fill="EDE9FE"/>
+          </w:tcPr>
+          <w:p>
+            <w:pPr>
+              <w:spacing w:before="0" w:after="0"/>
+            </w:pPr>
+            <w:r>
+              <w:rPr>
+                <w:sz w:val="7"/>
+              </w:rPr>
+              <w:t>Payload / Schema</w:t>
+            </w:r>
+          </w:p>
+        </w:tc>
+        <w:tc>
+          <w:tcPr>
+            <w:tcW w:type="dxa" w:w="2506"/>
+            <w:shd w:fill="EDE9FE"/>
+          </w:tcPr>
+          <w:p>
+            <w:pPr>
+              <w:spacing w:before="0" w:after="0"/>
+            </w:pPr>
+            <w:r>
+              <w:rPr>
+                <w:sz w:val="7"/>
+              </w:rPr>
+              <w:t>Persistence Owner</w:t>
+            </w:r>
+          </w:p>
+        </w:tc>
+      </w:tr>
+      <w:tr>
+        <w:tc>
+          <w:tcPr>
+            <w:tcW w:type="dxa" w:w="2506"/>
+          </w:tcPr>
+          <w:p>
+            <w:pPr>
+              <w:spacing w:before="0" w:after="0"/>
+            </w:pPr>
+            <w:r>
+              <w:rPr>
+                <w:sz w:val="7"/>
+              </w:rPr>
+              <w:t>STR-01-VIEW-CONVERSATION</w:t>
+            </w:r>
+          </w:p>
+        </w:tc>
+        <w:tc>
+          <w:tcPr>
+            <w:tcW w:type="dxa" w:w="2506"/>
+          </w:tcPr>
+          <w:p>
+            <w:pPr>
+              <w:spacing w:before="0" w:after="0"/>
+            </w:pPr>
+            <w:r>
+              <w:rPr>
+                <w:sz w:val="7"/>
+              </w:rPr>
+              <w:t>getStrategicConversationProjection</w:t>
+            </w:r>
+          </w:p>
+        </w:tc>
+        <w:tc>
+          <w:tcPr>
+            <w:tcW w:type="dxa" w:w="2506"/>
+          </w:tcPr>
+          <w:p>
+            <w:pPr>
+              <w:spacing w:before="0" w:after="0"/>
+            </w:pPr>
+            <w:r>
+              <w:rPr>
+                <w:sz w:val="7"/>
+              </w:rPr>
+              <w:t>method_path</w:t>
+            </w:r>
+          </w:p>
+        </w:tc>
+        <w:tc>
+          <w:tcPr>
+            <w:tcW w:type="dxa" w:w="2506"/>
+          </w:tcPr>
+          <w:p>
+            <w:pPr>
+              <w:spacing w:before="0" w:after="0"/>
+            </w:pPr>
+            <w:r>
+              <w:rPr>
+                <w:sz w:val="7"/>
+              </w:rPr>
+              <w:t>GET /v1/conversations/{CONVERSATION_ID}/projections/strategy</w:t>
+            </w:r>
+          </w:p>
+        </w:tc>
+        <w:tc>
+          <w:tcPr>
+            <w:tcW w:type="dxa" w:w="2506"/>
+          </w:tcPr>
+          <w:p>
+            <w:pPr>
+              <w:spacing w:before="0" w:after="0"/>
+            </w:pPr>
+            <w:r>
+              <w:rPr>
+                <w:sz w:val="7"/>
+              </w:rPr>
+              <w:t>N/A</w:t>
+            </w:r>
+          </w:p>
+        </w:tc>
+        <w:tc>
+          <w:tcPr>
+            <w:tcW w:type="dxa" w:w="2506"/>
+          </w:tcPr>
+          <w:p>
+            <w:pPr>
+              <w:spacing w:before="0" w:after="0"/>
+            </w:pPr>
+            <w:r>
+              <w:rPr>
+                <w:sz w:val="7"/>
+              </w:rPr>
+              <w:t>N/A</w:t>
+            </w:r>
+          </w:p>
+        </w:tc>
+      </w:tr>
+      <w:tr>
+        <w:tc>
+          <w:tcPr>
+            <w:tcW w:type="dxa" w:w="2506"/>
+          </w:tcPr>
+          <w:p>
+            <w:pPr>
+              <w:spacing w:before="0" w:after="0"/>
+            </w:pPr>
+            <w:r>
+              <w:rPr>
+                <w:sz w:val="7"/>
+              </w:rPr>
+              <w:t>STR-01-BTN-ATTACH</w:t>
+            </w:r>
+          </w:p>
+        </w:tc>
+        <w:tc>
+          <w:tcPr>
+            <w:tcW w:type="dxa" w:w="2506"/>
+          </w:tcPr>
+          <w:p>
+            <w:pPr>
+              <w:spacing w:before="0" w:after="0"/>
+            </w:pPr>
+            <w:r>
+              <w:rPr>
+                <w:sz w:val="7"/>
+              </w:rPr>
+              <w:t>getConversationAttachmentContext</w:t>
+            </w:r>
+          </w:p>
+        </w:tc>
+        <w:tc>
+          <w:tcPr>
+            <w:tcW w:type="dxa" w:w="2506"/>
+          </w:tcPr>
+          <w:p>
+            <w:pPr>
+              <w:spacing w:before="0" w:after="0"/>
+            </w:pPr>
+            <w:r>
+              <w:rPr>
+                <w:sz w:val="7"/>
+              </w:rPr>
+              <w:t>method_path</w:t>
+            </w:r>
+          </w:p>
+        </w:tc>
+        <w:tc>
+          <w:tcPr>
+            <w:tcW w:type="dxa" w:w="2506"/>
+          </w:tcPr>
+          <w:p>
+            <w:pPr>
+              <w:spacing w:before="0" w:after="0"/>
+            </w:pPr>
+            <w:r>
+              <w:rPr>
+                <w:sz w:val="7"/>
+              </w:rPr>
+              <w:t>GET /v1/conversations/{CONVERSATION_ID}/attachments/{ATTACHMENT_ID}/context</w:t>
+            </w:r>
+          </w:p>
+        </w:tc>
+        <w:tc>
+          <w:tcPr>
+            <w:tcW w:type="dxa" w:w="2506"/>
+          </w:tcPr>
+          <w:p>
+            <w:pPr>
+              <w:spacing w:before="0" w:after="0"/>
+            </w:pPr>
+            <w:r>
+              <w:rPr>
+                <w:sz w:val="7"/>
+              </w:rPr>
+              <w:t>N/A</w:t>
+            </w:r>
+          </w:p>
+        </w:tc>
+        <w:tc>
+          <w:tcPr>
+            <w:tcW w:type="dxa" w:w="2506"/>
+          </w:tcPr>
+          <w:p>
+            <w:pPr>
+              <w:spacing w:before="0" w:after="0"/>
+            </w:pPr>
+            <w:r>
+              <w:rPr>
+                <w:sz w:val="7"/>
+              </w:rPr>
+              <w:t>N/A</w:t>
+            </w:r>
+          </w:p>
+        </w:tc>
+      </w:tr>
+      <w:tr>
+        <w:tc>
+          <w:tcPr>
+            <w:tcW w:type="dxa" w:w="2506"/>
+          </w:tcPr>
+          <w:p>
+            <w:pPr>
+              <w:spacing w:before="0" w:after="0"/>
+            </w:pPr>
+            <w:r>
+              <w:rPr>
+                <w:sz w:val="7"/>
+              </w:rPr>
+              <w:t>STR-01-INP-MESSAGE</w:t>
+            </w:r>
+          </w:p>
+        </w:tc>
+        <w:tc>
+          <w:tcPr>
+            <w:tcW w:type="dxa" w:w="2506"/>
+          </w:tcPr>
+          <w:p>
+            <w:pPr>
+              <w:spacing w:before="0" w:after="0"/>
+            </w:pPr>
+            <w:r>
+              <w:rPr>
+                <w:sz w:val="7"/>
+              </w:rPr>
+              <w:t>sendConversationMessage</w:t>
+            </w:r>
+          </w:p>
+        </w:tc>
+        <w:tc>
+          <w:tcPr>
+            <w:tcW w:type="dxa" w:w="2506"/>
+          </w:tcPr>
+          <w:p>
+            <w:pPr>
+              <w:spacing w:before="0" w:after="0"/>
+            </w:pPr>
+            <w:r>
+              <w:rPr>
+                <w:sz w:val="7"/>
+              </w:rPr>
+              <w:t>payload_schema, persistence_owner</w:t>
+            </w:r>
+          </w:p>
+        </w:tc>
+        <w:tc>
+          <w:tcPr>
+            <w:tcW w:type="dxa" w:w="2506"/>
+          </w:tcPr>
+          <w:p>
+            <w:pPr>
+              <w:spacing w:before="0" w:after="0"/>
+            </w:pPr>
+            <w:r>
+              <w:rPr>
+                <w:sz w:val="7"/>
+              </w:rPr>
+              <w:t>POST /v1/conversations/{CONVERSATION_ID}/messages</w:t>
+            </w:r>
+          </w:p>
+        </w:tc>
+        <w:tc>
+          <w:tcPr>
+            <w:tcW w:type="dxa" w:w="2506"/>
+          </w:tcPr>
+          <w:p>
+            <w:pPr>
+              <w:spacing w:before="0" w:after="0"/>
+            </w:pPr>
+            <w:r>
+              <w:rPr>
+                <w:sz w:val="7"/>
+              </w:rPr>
+              <w:t>SendConversationMessageRequest</w:t>
+            </w:r>
+          </w:p>
+        </w:tc>
+        <w:tc>
+          <w:tcPr>
+            <w:tcW w:type="dxa" w:w="2506"/>
+          </w:tcPr>
+          <w:p>
+            <w:pPr>
+              <w:spacing w:before="0" w:after="0"/>
+            </w:pPr>
+            <w:r>
+              <w:rPr>
+                <w:sz w:val="7"/>
+              </w:rPr>
+              <w:t>Shared Conversation Core / ConversationMessage + ConversationContextBinding</w:t>
+            </w:r>
+          </w:p>
+        </w:tc>
+      </w:tr>
+      <w:tr>
+        <w:tc>
+          <w:tcPr>
+            <w:tcW w:type="dxa" w:w="2506"/>
+          </w:tcPr>
+          <w:p>
+            <w:pPr>
+              <w:spacing w:before="0" w:after="0"/>
+            </w:pPr>
+            <w:r>
+              <w:rPr>
+                <w:sz w:val="7"/>
+              </w:rPr>
+              <w:t>STR-01-BTN-SEND</w:t>
+            </w:r>
+          </w:p>
+        </w:tc>
+        <w:tc>
+          <w:tcPr>
+            <w:tcW w:type="dxa" w:w="2506"/>
+          </w:tcPr>
+          <w:p>
+            <w:pPr>
+              <w:spacing w:before="0" w:after="0"/>
+            </w:pPr>
+            <w:r>
+              <w:rPr>
+                <w:sz w:val="7"/>
+              </w:rPr>
+              <w:t>sendConversationMessage</w:t>
+            </w:r>
+          </w:p>
+        </w:tc>
+        <w:tc>
+          <w:tcPr>
+            <w:tcW w:type="dxa" w:w="2506"/>
+          </w:tcPr>
+          <w:p>
+            <w:pPr>
+              <w:spacing w:before="0" w:after="0"/>
+            </w:pPr>
+            <w:r>
+              <w:rPr>
+                <w:sz w:val="7"/>
+              </w:rPr>
+              <w:t>payload_schema, persistence_owner</w:t>
+            </w:r>
+          </w:p>
+        </w:tc>
+        <w:tc>
+          <w:tcPr>
+            <w:tcW w:type="dxa" w:w="2506"/>
+          </w:tcPr>
+          <w:p>
+            <w:pPr>
+              <w:spacing w:before="0" w:after="0"/>
+            </w:pPr>
+            <w:r>
+              <w:rPr>
+                <w:sz w:val="7"/>
+              </w:rPr>
+              <w:t>POST /v1/conversations/{CONVERSATION_ID}/messages</w:t>
+            </w:r>
+          </w:p>
+        </w:tc>
+        <w:tc>
+          <w:tcPr>
+            <w:tcW w:type="dxa" w:w="2506"/>
+          </w:tcPr>
+          <w:p>
+            <w:pPr>
+              <w:spacing w:before="0" w:after="0"/>
+            </w:pPr>
+            <w:r>
+              <w:rPr>
+                <w:sz w:val="7"/>
+              </w:rPr>
+              <w:t>SendConversationMessageRequest</w:t>
+            </w:r>
+          </w:p>
+        </w:tc>
+        <w:tc>
+          <w:tcPr>
+            <w:tcW w:type="dxa" w:w="2506"/>
+          </w:tcPr>
+          <w:p>
+            <w:pPr>
+              <w:spacing w:before="0" w:after="0"/>
+            </w:pPr>
+            <w:r>
+              <w:rPr>
+                <w:sz w:val="7"/>
+              </w:rPr>
+              <w:t>Shared Conversation Core / ConversationMessage + ConversationContextBinding</w:t>
+            </w:r>
+          </w:p>
+        </w:tc>
+      </w:tr>
+      <w:tr>
+        <w:tc>
+          <w:tcPr>
+            <w:tcW w:type="dxa" w:w="2506"/>
+          </w:tcPr>
+          <w:p>
+            <w:pPr>
+              <w:spacing w:before="0" w:after="0"/>
+            </w:pPr>
+            <w:r>
+              <w:rPr>
+                <w:sz w:val="7"/>
+              </w:rPr>
+              <w:t>STR-01-BTN-STOP</w:t>
+            </w:r>
+          </w:p>
+        </w:tc>
+        <w:tc>
+          <w:tcPr>
+            <w:tcW w:type="dxa" w:w="2506"/>
+          </w:tcPr>
+          <w:p>
+            <w:pPr>
+              <w:spacing w:before="0" w:after="0"/>
+            </w:pPr>
+            <w:r>
+              <w:rPr>
+                <w:sz w:val="7"/>
+              </w:rPr>
+              <w:t>stopConversationGeneration</w:t>
+            </w:r>
+          </w:p>
+        </w:tc>
+        <w:tc>
+          <w:tcPr>
+            <w:tcW w:type="dxa" w:w="2506"/>
+          </w:tcPr>
+          <w:p>
+            <w:pPr>
+              <w:spacing w:before="0" w:after="0"/>
+            </w:pPr>
+            <w:r>
+              <w:rPr>
+                <w:sz w:val="7"/>
+              </w:rPr>
+              <w:t>payload_schema, persistence_owner</w:t>
+            </w:r>
+          </w:p>
+        </w:tc>
+        <w:tc>
+          <w:tcPr>
+            <w:tcW w:type="dxa" w:w="2506"/>
+          </w:tcPr>
+          <w:p>
+            <w:pPr>
+              <w:spacing w:before="0" w:after="0"/>
+            </w:pPr>
+            <w:r>
+              <w:rPr>
+                <w:sz w:val="7"/>
+              </w:rPr>
+              <w:t>POST /v1/conversations/{CONVERSATION_ID}/generation/stop</w:t>
+            </w:r>
+          </w:p>
+        </w:tc>
+        <w:tc>
+          <w:tcPr>
+            <w:tcW w:type="dxa" w:w="2506"/>
+          </w:tcPr>
+          <w:p>
+            <w:pPr>
+              <w:spacing w:before="0" w:after="0"/>
+            </w:pPr>
+            <w:r>
+              <w:rPr>
+                <w:sz w:val="7"/>
+              </w:rPr>
+              <w:t>StopConversationGenerationRequest</w:t>
+            </w:r>
+          </w:p>
+        </w:tc>
+        <w:tc>
+          <w:tcPr>
+            <w:tcW w:type="dxa" w:w="2506"/>
+          </w:tcPr>
+          <w:p>
+            <w:pPr>
+              <w:spacing w:before="0" w:after="0"/>
+            </w:pPr>
+            <w:r>
+              <w:rPr>
+                <w:sz w:val="7"/>
+              </w:rPr>
+              <w:t>ACPOS-AI-03 Runtime Job + ACPOS-AI-02 ConversationAuditEnvelope</w:t>
+            </w:r>
+          </w:p>
+        </w:tc>
+      </w:tr>
+    </w:tbl>
     <w:sectPr>
-      <w:pgSz w:w="12240" w:h="15840" w:orient="landscape"/>
+      <w:pgSz w:w="15840" w:h="12240" w:orient="landscape"/>
       <w:pgMar w:top="475" w:right="403" w:bottom="475" w:left="403" w:header="259" w:footer="259" w:gutter="0"/>
       <w:cols w:space="720"/>
       <w:docGrid w:linePitch="360"/>

</xml_diff>

<commit_message>
docs(acpos): close system08 strategy contract gaps
</commit_message>
<xml_diff>
--- a/ACPOS_STR-01_WORKSPACE_MOTHER_BASIC_DESIGN_TECH_PURPLE_v1.0.docx
+++ b/ACPOS_STR-01_WORKSPACE_MOTHER_BASIC_DESIGN_TECH_PURPLE_v1.0.docx
@@ -24343,10 +24343,7 @@
           </w:tcPr>
           <w:p>
             <w:r>
-              <w:rPr>
-                <w:sz w:val="10"/>
-              </w:rPr>
-              <w:t>—</w:t>
+              <w:t>AI-01 Context Owner / Governed Strategy Context Adoption Link + System 08 Audit</w:t>
             </w:r>
           </w:p>
         </w:tc>
@@ -25455,10 +25452,7 @@
           </w:tcPr>
           <w:p>
             <w:r>
-              <w:rPr>
-                <w:sz w:val="10"/>
-              </w:rPr>
-              <w:t>—</w:t>
+              <w:t>SubmitStrategyReviewRequest</w:t>
             </w:r>
           </w:p>
         </w:tc>
@@ -25481,10 +25475,7 @@
           </w:tcPr>
           <w:p>
             <w:r>
-              <w:rPr>
-                <w:sz w:val="10"/>
-              </w:rPr>
-              <w:t>—</w:t>
+              <w:t>POST /v1/state-commands/strategycandidate/submitstrategyreview</w:t>
             </w:r>
           </w:p>
         </w:tc>
@@ -25507,10 +25498,7 @@
           </w:tcPr>
           <w:p>
             <w:r>
-              <w:rPr>
-                <w:sz w:val="10"/>
-              </w:rPr>
-              <w:t>—</w:t>
+              <w:t>System 08 / StrategyCandidate + Review State/Audit</w:t>
             </w:r>
           </w:p>
         </w:tc>
@@ -35759,8 +35747,355 @@
         </w:tc>
       </w:tr>
     </w:tbl>
+    <w:p>
+      <w:pPr>
+        <w:sectPr>
+          <w:pgSz w:w="15840" w:h="12240" w:orient="landscape"/>
+          <w:pgMar w:top="475" w:right="403" w:bottom="475" w:left="403" w:header="259" w:footer="259" w:gutter="0"/>
+          <w:cols w:space="720"/>
+          <w:docGrid w:linePitch="360"/>
+        </w:sectPr>
+      </w:pPr>
+    </w:p>
+    <w:p>
+      <w:pPr>
+        <w:pStyle w:val="Heading1"/>
+      </w:pPr>
+      <w:r>
+        <w:t>Batch 43 · STR-01 Strategy Contract Binding Ledger</w:t>
+      </w:r>
+    </w:p>
+    <w:p>
+      <w:r>
+        <w:rPr>
+          <w:b/>
+        </w:rPr>
+        <w:t xml:space="preserve">[ACPOS-20260922-BATCH-43-SYSTEM08-STRATEGY-CONTRACT-REMEDIATION-V1::PAGE::STR-01] </w:t>
+      </w:r>
+      <w:r>
+        <w:t>Review submission is a governed request to enter REVIEW_REQUIRED, never an approval. Context adoption requires prior human review and persists through AI-01 Context authority plus System 08 audit linkage; Strategy does not create a second Context Engine.</w:t>
+      </w:r>
+    </w:p>
+    <w:tbl>
+      <w:tblPr>
+        <w:tblStyle w:val="TableGrid"/>
+        <w:tblW w:type="auto" w:w="0"/>
+        <w:tblLook w:firstColumn="1" w:firstRow="1" w:lastColumn="0" w:lastRow="0" w:noHBand="0" w:noVBand="1" w:val="04A0"/>
+      </w:tblPr>
+      <w:tblGrid>
+        <w:gridCol w:w="1906"/>
+        <w:gridCol w:w="1906"/>
+        <w:gridCol w:w="1906"/>
+        <w:gridCol w:w="1906"/>
+        <w:gridCol w:w="1906"/>
+        <w:gridCol w:w="1906"/>
+      </w:tblGrid>
+      <w:tr>
+        <w:trPr>
+          <w:tblHeader w:val="true"/>
+        </w:trPr>
+        <w:tc>
+          <w:tcPr>
+            <w:tcW w:type="dxa" w:w="1906"/>
+            <w:shd w:fill="EDE9FE"/>
+          </w:tcPr>
+          <w:p>
+            <w:pPr>
+              <w:spacing w:before="0" w:after="0"/>
+            </w:pPr>
+            <w:r>
+              <w:rPr>
+                <w:sz w:val="7"/>
+              </w:rPr>
+              <w:t>Control UID</w:t>
+            </w:r>
+          </w:p>
+        </w:tc>
+        <w:tc>
+          <w:tcPr>
+            <w:tcW w:type="dxa" w:w="1906"/>
+            <w:shd w:fill="EDE9FE"/>
+          </w:tcPr>
+          <w:p>
+            <w:pPr>
+              <w:spacing w:before="0" w:after="0"/>
+            </w:pPr>
+            <w:r>
+              <w:rPr>
+                <w:sz w:val="7"/>
+              </w:rPr>
+              <w:t>Operation</w:t>
+            </w:r>
+          </w:p>
+        </w:tc>
+        <w:tc>
+          <w:tcPr>
+            <w:tcW w:type="dxa" w:w="1906"/>
+            <w:shd w:fill="EDE9FE"/>
+          </w:tcPr>
+          <w:p>
+            <w:pPr>
+              <w:spacing w:before="0" w:after="0"/>
+            </w:pPr>
+            <w:r>
+              <w:rPr>
+                <w:sz w:val="7"/>
+              </w:rPr>
+              <w:t>Method / Path</w:t>
+            </w:r>
+          </w:p>
+        </w:tc>
+        <w:tc>
+          <w:tcPr>
+            <w:tcW w:type="dxa" w:w="1906"/>
+            <w:shd w:fill="EDE9FE"/>
+          </w:tcPr>
+          <w:p>
+            <w:pPr>
+              <w:spacing w:before="0" w:after="0"/>
+            </w:pPr>
+            <w:r>
+              <w:rPr>
+                <w:sz w:val="7"/>
+              </w:rPr>
+              <w:t>Payload / Schema</w:t>
+            </w:r>
+          </w:p>
+        </w:tc>
+        <w:tc>
+          <w:tcPr>
+            <w:tcW w:type="dxa" w:w="1906"/>
+            <w:shd w:fill="EDE9FE"/>
+          </w:tcPr>
+          <w:p>
+            <w:pPr>
+              <w:spacing w:before="0" w:after="0"/>
+            </w:pPr>
+            <w:r>
+              <w:rPr>
+                <w:sz w:val="7"/>
+              </w:rPr>
+              <w:t>Persistence Owner</w:t>
+            </w:r>
+          </w:p>
+        </w:tc>
+        <w:tc>
+          <w:tcPr>
+            <w:tcW w:type="dxa" w:w="1906"/>
+            <w:shd w:fill="EDE9FE"/>
+          </w:tcPr>
+          <w:p>
+            <w:pPr>
+              <w:spacing w:before="0" w:after="0"/>
+            </w:pPr>
+            <w:r>
+              <w:rPr>
+                <w:sz w:val="7"/>
+              </w:rPr>
+              <w:t>Semantics</w:t>
+            </w:r>
+          </w:p>
+        </w:tc>
+      </w:tr>
+      <w:tr>
+        <w:tc>
+          <w:tcPr>
+            <w:tcW w:type="dxa" w:w="1906"/>
+          </w:tcPr>
+          <w:p>
+            <w:pPr>
+              <w:spacing w:before="0" w:after="0"/>
+            </w:pPr>
+            <w:r>
+              <w:rPr>
+                <w:sz w:val="7"/>
+              </w:rPr>
+              <w:t>STR-01-BTN-SUBMIT-REVIEW</w:t>
+            </w:r>
+          </w:p>
+        </w:tc>
+        <w:tc>
+          <w:tcPr>
+            <w:tcW w:type="dxa" w:w="1906"/>
+          </w:tcPr>
+          <w:p>
+            <w:pPr>
+              <w:spacing w:before="0" w:after="0"/>
+            </w:pPr>
+            <w:r>
+              <w:rPr>
+                <w:sz w:val="7"/>
+              </w:rPr>
+              <w:t>submitStrategyReview</w:t>
+            </w:r>
+          </w:p>
+        </w:tc>
+        <w:tc>
+          <w:tcPr>
+            <w:tcW w:type="dxa" w:w="1906"/>
+          </w:tcPr>
+          <w:p>
+            <w:pPr>
+              <w:spacing w:before="0" w:after="0"/>
+            </w:pPr>
+            <w:r>
+              <w:rPr>
+                <w:sz w:val="7"/>
+              </w:rPr>
+              <w:t>POST /v1/state-commands/strategycandidate/submitstrategyreview</w:t>
+            </w:r>
+          </w:p>
+        </w:tc>
+        <w:tc>
+          <w:tcPr>
+            <w:tcW w:type="dxa" w:w="1906"/>
+          </w:tcPr>
+          <w:p>
+            <w:pPr>
+              <w:spacing w:before="0" w:after="0"/>
+            </w:pPr>
+            <w:r>
+              <w:rPr>
+                <w:sz w:val="7"/>
+              </w:rPr>
+              <w:t>SubmitStrategyReviewRequest</w:t>
+            </w:r>
+          </w:p>
+        </w:tc>
+        <w:tc>
+          <w:tcPr>
+            <w:tcW w:type="dxa" w:w="1906"/>
+          </w:tcPr>
+          <w:p>
+            <w:pPr>
+              <w:spacing w:before="0" w:after="0"/>
+            </w:pPr>
+            <w:r>
+              <w:rPr>
+                <w:sz w:val="7"/>
+              </w:rPr>
+              <w:t>System 08 / StrategyCandidate + Review State/Audit</w:t>
+            </w:r>
+          </w:p>
+        </w:tc>
+        <w:tc>
+          <w:tcPr>
+            <w:tcW w:type="dxa" w:w="1906"/>
+          </w:tcPr>
+          <w:p>
+            <w:pPr>
+              <w:spacing w:before="0" w:after="0"/>
+            </w:pPr>
+            <w:r>
+              <w:rPr>
+                <w:sz w:val="7"/>
+              </w:rPr>
+              <w:t>CANDIDATE_READY→REVIEW_REQUIRED requires exact candidate, expected_version, review permission and evidence; submission creates/updates governed review-request state only and must not create an approval decision.</w:t>
+            </w:r>
+          </w:p>
+        </w:tc>
+      </w:tr>
+      <w:tr>
+        <w:tc>
+          <w:tcPr>
+            <w:tcW w:type="dxa" w:w="1906"/>
+          </w:tcPr>
+          <w:p>
+            <w:pPr>
+              <w:spacing w:before="0" w:after="0"/>
+            </w:pPr>
+            <w:r>
+              <w:rPr>
+                <w:sz w:val="7"/>
+              </w:rPr>
+              <w:t>STR-01-BTN-ADOPT</w:t>
+            </w:r>
+          </w:p>
+        </w:tc>
+        <w:tc>
+          <w:tcPr>
+            <w:tcW w:type="dxa" w:w="1906"/>
+          </w:tcPr>
+          <w:p>
+            <w:pPr>
+              <w:spacing w:before="0" w:after="0"/>
+            </w:pPr>
+            <w:r>
+              <w:rPr>
+                <w:sz w:val="7"/>
+              </w:rPr>
+              <w:t>adoptAsContextCandidate</w:t>
+            </w:r>
+          </w:p>
+        </w:tc>
+        <w:tc>
+          <w:tcPr>
+            <w:tcW w:type="dxa" w:w="1906"/>
+          </w:tcPr>
+          <w:p>
+            <w:pPr>
+              <w:spacing w:before="0" w:after="0"/>
+            </w:pPr>
+            <w:r>
+              <w:rPr>
+                <w:sz w:val="7"/>
+              </w:rPr>
+              <w:t>UNCHANGED</w:t>
+            </w:r>
+          </w:p>
+        </w:tc>
+        <w:tc>
+          <w:tcPr>
+            <w:tcW w:type="dxa" w:w="1906"/>
+          </w:tcPr>
+          <w:p>
+            <w:pPr>
+              <w:spacing w:before="0" w:after="0"/>
+            </w:pPr>
+            <w:r>
+              <w:rPr>
+                <w:sz w:val="7"/>
+              </w:rPr>
+              <w:t>UNCHANGED</w:t>
+            </w:r>
+          </w:p>
+        </w:tc>
+        <w:tc>
+          <w:tcPr>
+            <w:tcW w:type="dxa" w:w="1906"/>
+          </w:tcPr>
+          <w:p>
+            <w:pPr>
+              <w:spacing w:before="0" w:after="0"/>
+            </w:pPr>
+            <w:r>
+              <w:rPr>
+                <w:sz w:val="7"/>
+              </w:rPr>
+              <w:t>AI-01 Context Owner / Governed Strategy Context Adoption Link + System 08 Audit</w:t>
+            </w:r>
+          </w:p>
+        </w:tc>
+        <w:tc>
+          <w:tcPr>
+            <w:tcW w:type="dxa" w:w="1906"/>
+          </w:tcPr>
+          <w:p>
+            <w:pPr>
+              <w:spacing w:before="0" w:after="0"/>
+            </w:pPr>
+            <w:r>
+              <w:rPr>
+                <w:sz w:val="7"/>
+              </w:rPr>
+              <w:t>Adopt-as-context occurs only after human review/decision evidence and does not execute an owner module. Context authority remains AI-01; System 08 preserves candidate/decision/audit linkage without creating a second Context Engine.</w:t>
+            </w:r>
+          </w:p>
+        </w:tc>
+      </w:tr>
+    </w:tbl>
     <w:sectPr>
-      <w:pgSz w:w="15840" w:h="12240" w:orient="landscape"/>
+      <w:pgSz w:w="12240" w:h="15840" w:orient="landscape"/>
       <w:pgMar w:top="475" w:right="403" w:bottom="475" w:left="403" w:header="259" w:footer="259" w:gutter="0"/>
       <w:cols w:space="720"/>
       <w:docGrid w:linePitch="360"/>

</xml_diff>

<commit_message>
fix(acpos): close bidirectional document contract defects
</commit_message>
<xml_diff>
--- a/ACPOS_STR-01_WORKSPACE_MOTHER_BASIC_DESIGN_TECH_PURPLE_v1.0.docx
+++ b/ACPOS_STR-01_WORKSPACE_MOTHER_BASIC_DESIGN_TECH_PURPLE_v1.0.docx
@@ -11254,15 +11254,16 @@
             <w:pPr>
               <w:spacing w:after="0" w:before="0"/>
             </w:pPr>
-            <w:r/>
-            <w:r>
-              <w:rPr>
-                <w:rFonts w:ascii="Noto Sans CJK TC" w:hAnsi="Noto Sans CJK TC" w:eastAsia="Noto Sans CJK TC"/>
-                <w:b w:val="0"/>
-                <w:color w:val="29243A"/>
-                <w:sz w:val="10"/>
-              </w:rPr>
-              <w:t>STR-01-ACT-NOOP</w:t>
+            <w:r>
+              <w:t>—</w:t>
+            </w:r>
+            <w:r>
+              <w:rPr>
+                <w:rFonts w:ascii="Noto Sans CJK TC" w:hAnsi="Noto Sans CJK TC" w:eastAsia="Noto Sans CJK TC"/>
+                <w:b w:val="0"/>
+                <w:color w:val="29243A"/>
+                <w:sz w:val="10"/>
+              </w:rPr>
             </w:r>
           </w:p>
         </w:tc>
@@ -11382,15 +11383,16 @@
             <w:pPr>
               <w:spacing w:after="0" w:before="0"/>
             </w:pPr>
-            <w:r/>
-            <w:r>
-              <w:rPr>
-                <w:rFonts w:ascii="Noto Sans CJK TC" w:hAnsi="Noto Sans CJK TC" w:eastAsia="Noto Sans CJK TC"/>
-                <w:b w:val="0"/>
-                <w:color w:val="29243A"/>
-                <w:sz w:val="10"/>
-              </w:rPr>
-              <w:t>STR-01-ACT-NOOP</w:t>
+            <w:r>
+              <w:t>—</w:t>
+            </w:r>
+            <w:r>
+              <w:rPr>
+                <w:rFonts w:ascii="Noto Sans CJK TC" w:hAnsi="Noto Sans CJK TC" w:eastAsia="Noto Sans CJK TC"/>
+                <w:b w:val="0"/>
+                <w:color w:val="29243A"/>
+                <w:sz w:val="10"/>
+              </w:rPr>
             </w:r>
           </w:p>
         </w:tc>
@@ -24423,7 +24425,7 @@
               <w:rPr>
                 <w:sz w:val="10"/>
               </w:rPr>
-              <w:t>STR-01-ACT-NOOP</w:t>
+              <w:t>—</w:t>
             </w:r>
           </w:p>
         </w:tc>
@@ -33768,7 +33770,7 @@
               <w:rPr>
                 <w:sz w:val="10"/>
               </w:rPr>
-              <w:t>STR-01-ACT-NOOP</w:t>
+              <w:t>—</w:t>
             </w:r>
           </w:p>
         </w:tc>

</xml_diff>